<commit_message>
sync: match submitted manuscript — add ethical statements, consolidate address line
Sync manuscript_en.md to match the version submitted to Empirical Economics:
- Add Ethics approval, Consent to participate, Consent to publish
- Reorder Statements and Declarations alphabetically
- Consolidate address/phone/email into single line
- Rebuild all outputs

Co-Authored-By: Tatsuki Onishi <bougtoir@gmail.com>
</commit_message>
<xml_diff>
--- a/gdp_tempo_paper/manuscript/title_page_en.docx
+++ b/gdp_tempo_paper/manuscript/title_page_en.docx
@@ -78,27 +78,7 @@
           <w:i w:val="0"/>
           <w:sz w:val="24"/>
         </w:rPr>
-        <w:t>1-1-1, Bamba, Hikone, Shiga, 522-8522 Japan</w:t>
-      </w:r>
-    </w:p>
-    <w:p>
-      <w:pPr>
-        <w:spacing w:after="0" w:before="0" w:line="360" w:lineRule="auto"/>
-      </w:pPr>
-    </w:p>
-    <w:p>
-      <w:pPr>
-        <w:spacing w:after="120" w:line="360" w:lineRule="auto"/>
-        <w:ind w:firstLine="480"/>
-      </w:pPr>
-      <w:r>
-        <w:rPr>
-          <w:rFonts w:ascii="Times New Roman" w:hAnsi="Times New Roman" w:eastAsia="MS Mincho"/>
-          <w:b w:val="0"/>
-          <w:i w:val="0"/>
-          <w:sz w:val="24"/>
-        </w:rPr>
-        <w:t>Telephone: +81-749-27-1023. E-mail: bougtoir@gmail.com. ORCID: 0000-0001-7261-9062.</w:t>
+        <w:t>1-1-1, Bamba, Hikone, Shiga, 522-8522 Japan, Telephone: +81-749-27-1023, E-mail: bougtoir@gmail.com, ORCID: 0000-0001-7261-9062</w:t>
       </w:r>
     </w:p>
     <w:p>
@@ -167,7 +147,7 @@
           <w:i/>
           <w:sz w:val="24"/>
         </w:rPr>
-        <w:t>Funding.</w:t>
+        <w:t>Consent to participate.</w:t>
       </w:r>
       <w:r>
         <w:rPr>
@@ -176,7 +156,36 @@
           <w:i w:val="0"/>
           <w:sz w:val="24"/>
         </w:rPr>
-        <w:t xml:space="preserve"> No external funding was received for this research.</w:t>
+        <w:t xml:space="preserve"> Not applicable.</w:t>
+      </w:r>
+    </w:p>
+    <w:p>
+      <w:pPr>
+        <w:spacing w:after="0" w:before="0" w:line="360" w:lineRule="auto"/>
+      </w:pPr>
+    </w:p>
+    <w:p>
+      <w:pPr>
+        <w:spacing w:after="120" w:line="360" w:lineRule="auto"/>
+        <w:ind w:firstLine="480"/>
+      </w:pPr>
+      <w:r>
+        <w:rPr>
+          <w:rFonts w:ascii="Times New Roman" w:hAnsi="Times New Roman" w:eastAsia="MS Mincho"/>
+          <w:b w:val="0"/>
+          <w:i/>
+          <w:sz w:val="24"/>
+        </w:rPr>
+        <w:t>Consent to publish.</w:t>
+      </w:r>
+      <w:r>
+        <w:rPr>
+          <w:rFonts w:ascii="Times New Roman" w:hAnsi="Times New Roman" w:eastAsia="MS Mincho"/>
+          <w:b w:val="0"/>
+          <w:i w:val="0"/>
+          <w:sz w:val="24"/>
+        </w:rPr>
+        <w:t xml:space="preserve"> Not applicable.</w:t>
       </w:r>
     </w:p>
     <w:p>
@@ -235,6 +244,64 @@
           <w:sz w:val="24"/>
         </w:rPr>
         <w:t xml:space="preserve"> The author used generative AI to assist with formatting the text, choosing words that suited the tone, and writing analysis code. The author reviewed and edited the content as needed and takes full responsibility for the content of the published article.</w:t>
+      </w:r>
+    </w:p>
+    <w:p>
+      <w:pPr>
+        <w:spacing w:after="0" w:before="0" w:line="360" w:lineRule="auto"/>
+      </w:pPr>
+    </w:p>
+    <w:p>
+      <w:pPr>
+        <w:spacing w:after="120" w:line="360" w:lineRule="auto"/>
+        <w:ind w:firstLine="480"/>
+      </w:pPr>
+      <w:r>
+        <w:rPr>
+          <w:rFonts w:ascii="Times New Roman" w:hAnsi="Times New Roman" w:eastAsia="MS Mincho"/>
+          <w:b w:val="0"/>
+          <w:i/>
+          <w:sz w:val="24"/>
+        </w:rPr>
+        <w:t>Ethics approval.</w:t>
+      </w:r>
+      <w:r>
+        <w:rPr>
+          <w:rFonts w:ascii="Times New Roman" w:hAnsi="Times New Roman" w:eastAsia="MS Mincho"/>
+          <w:b w:val="0"/>
+          <w:i w:val="0"/>
+          <w:sz w:val="24"/>
+        </w:rPr>
+        <w:t xml:space="preserve"> This research uses publicly available, aggregate macroeconomic data (Penn World Table 10.01, World Bank CWON, World Bank WDI, OECD GFCF). No human subjects, animals, or personally identifiable data were involved. Ethical approval was therefore not required.</w:t>
+      </w:r>
+    </w:p>
+    <w:p>
+      <w:pPr>
+        <w:spacing w:after="0" w:before="0" w:line="360" w:lineRule="auto"/>
+      </w:pPr>
+    </w:p>
+    <w:p>
+      <w:pPr>
+        <w:spacing w:after="120" w:line="360" w:lineRule="auto"/>
+        <w:ind w:firstLine="480"/>
+      </w:pPr>
+      <w:r>
+        <w:rPr>
+          <w:rFonts w:ascii="Times New Roman" w:hAnsi="Times New Roman" w:eastAsia="MS Mincho"/>
+          <w:b w:val="0"/>
+          <w:i/>
+          <w:sz w:val="24"/>
+        </w:rPr>
+        <w:t>Funding.</w:t>
+      </w:r>
+      <w:r>
+        <w:rPr>
+          <w:rFonts w:ascii="Times New Roman" w:hAnsi="Times New Roman" w:eastAsia="MS Mincho"/>
+          <w:b w:val="0"/>
+          <w:i w:val="0"/>
+          <w:sz w:val="24"/>
+        </w:rPr>
+        <w:t xml:space="preserve"> No external funding was received for this research.</w:t>
       </w:r>
     </w:p>
     <w:p>

</xml_diff>